<commit_message>
Add 'Becoming an AI Engineer' study tracker
- New React route at /becoming-an-ai-engineer
- 16-week, 8-phase AI engineer study plan with 112 tasks and resource links
- Blog-style AppLayout reusable component with icon, Sharer, description
- Sticky right panel: progress stats, phase nav, phase resources, settings
- Phase header with progress-fill background effect
- localStorage persistence (checked tasks, notes, start date, name)
- Consistent brand green theme, no dividers, card-style week boxes

Co-authored-by: Copilot <223556219+Copilot@users.noreply.github.com>
</commit_message>
<xml_diff>
--- a/public/PranshuGuptaResume.docx
+++ b/public/PranshuGuptaResume.docx
@@ -445,14 +445,28 @@
           <w:sz w:val="18"/>
           <w:szCs w:val="18"/>
         </w:rPr>
-        <w:t>deployment-time connection errors in distributed session management by implementing affinity drain and in-memory caching, reducing Redis writes by 9</w:t>
-      </w:r>
-      <w:r>
-        <w:rPr>
-          <w:sz w:val="18"/>
-          <w:szCs w:val="18"/>
-        </w:rPr>
-        <w:t>%.</w:t>
+        <w:t xml:space="preserve">deployment-time connection errors by implementing </w:t>
+      </w:r>
+      <w:r>
+        <w:rPr>
+          <w:sz w:val="18"/>
+          <w:szCs w:val="18"/>
+        </w:rPr>
+        <w:t xml:space="preserve">session </w:t>
+      </w:r>
+      <w:r>
+        <w:rPr>
+          <w:sz w:val="18"/>
+          <w:szCs w:val="18"/>
+        </w:rPr>
+        <w:t>affinity drain and in-memory caching</w:t>
+      </w:r>
+      <w:r>
+        <w:rPr>
+          <w:sz w:val="18"/>
+          <w:szCs w:val="18"/>
+        </w:rPr>
+        <w:t>.</w:t>
       </w:r>
     </w:p>
     <w:p>
@@ -829,42 +843,7 @@
           <w:sz w:val="18"/>
           <w:szCs w:val="18"/>
         </w:rPr>
-        <w:t>preventing</w:t>
-      </w:r>
-      <w:r>
-        <w:rPr>
-          <w:sz w:val="18"/>
-          <w:szCs w:val="18"/>
-        </w:rPr>
-        <w:t xml:space="preserve"> partition level</w:t>
-      </w:r>
-      <w:r>
-        <w:rPr>
-          <w:sz w:val="18"/>
-          <w:szCs w:val="18"/>
-        </w:rPr>
-        <w:t xml:space="preserve"> </w:t>
-      </w:r>
-      <w:r>
-        <w:rPr>
-          <w:sz w:val="18"/>
-          <w:szCs w:val="18"/>
-        </w:rPr>
-        <w:t>retry</w:t>
-      </w:r>
-      <w:r>
-        <w:rPr>
-          <w:sz w:val="18"/>
-          <w:szCs w:val="18"/>
-        </w:rPr>
-        <w:t>-storm outages</w:t>
-      </w:r>
-      <w:r>
-        <w:rPr>
-          <w:sz w:val="18"/>
-          <w:szCs w:val="18"/>
-        </w:rPr>
-        <w:t xml:space="preserve"> and noisy neighbor issues in control plane</w:t>
+        <w:t>preventing partition level retry-storm outages and noisy neighbor issues in control plane</w:t>
       </w:r>
       <w:r>
         <w:rPr>
@@ -1149,21 +1128,7 @@
           <w:sz w:val="18"/>
           <w:szCs w:val="18"/>
         </w:rPr>
-        <w:t xml:space="preserve">, </w:t>
-      </w:r>
-      <w:r>
-        <w:rPr>
-          <w:sz w:val="18"/>
-          <w:szCs w:val="18"/>
-        </w:rPr>
-        <w:t>eliminating 700M+ unnecessary executions/day</w:t>
-      </w:r>
-      <w:r>
-        <w:rPr>
-          <w:sz w:val="18"/>
-          <w:szCs w:val="18"/>
-        </w:rPr>
-        <w:t xml:space="preserve"> and improving system reliability</w:t>
+        <w:t>, eliminating 700M+ unnecessary executions/day and improving system reliability</w:t>
       </w:r>
       <w:r>
         <w:rPr>

</xml_diff>